<commit_message>
updated meeting minutes file
</commit_message>
<xml_diff>
--- a/Sprint1/Meeting Minutes.docx
+++ b/Sprint1/Meeting Minutes.docx
@@ -54,7 +54,15 @@
           <w:bCs/>
           <w:color w:val="000000"/>
         </w:rPr>
-        <w:t xml:space="preserve"> 2025</w:t>
+        <w:t xml:space="preserve"> 202</w:t>
+      </w:r>
+      <w:r>
+        <w:rPr>
+          <w:b/>
+          <w:bCs/>
+          <w:color w:val="000000"/>
+        </w:rPr>
+        <w:t>6</w:t>
       </w:r>
       <w:proofErr w:type="gramEnd"/>
     </w:p>
@@ -173,7 +181,7 @@
           <w:noProof/>
         </w:rPr>
         <w:pict w14:anchorId="71BBFF5B">
-          <v:rect id="_x0000_i1031" alt="" style="width:468pt;height:.05pt;mso-width-percent:0;mso-height-percent:0;mso-width-percent:0;mso-height-percent:0" o:hralign="center" o:hrstd="t" o:hr="t" fillcolor="#a0a0a0" stroked="f"/>
+          <v:rect id="_x0000_i1027" alt="" style="width:468pt;height:.05pt;mso-width-percent:0;mso-height-percent:0;mso-width-percent:0;mso-height-percent:0" o:hralign="center" o:hrstd="t" o:hr="t" fillcolor="#a0a0a0" stroked="f"/>
         </w:pict>
       </w:r>
     </w:p>
@@ -220,7 +228,15 @@
           <w:bCs/>
           <w:color w:val="000000"/>
         </w:rPr>
-        <w:t xml:space="preserve"> 30 3035</w:t>
+        <w:t xml:space="preserve"> 30 </w:t>
+      </w:r>
+      <w:r>
+        <w:rPr>
+          <w:b/>
+          <w:bCs/>
+          <w:color w:val="000000"/>
+        </w:rPr>
+        <w:t>2026</w:t>
       </w:r>
     </w:p>
     <w:p>
@@ -335,7 +351,7 @@
           <w:noProof/>
         </w:rPr>
         <w:pict w14:anchorId="63FB5F47">
-          <v:rect id="_x0000_i1030" alt="" style="width:468pt;height:.05pt;mso-width-percent:0;mso-height-percent:0;mso-width-percent:0;mso-height-percent:0" o:hralign="center" o:hrstd="t" o:hr="t" fillcolor="#a0a0a0" stroked="f"/>
+          <v:rect id="_x0000_i1026" alt="" style="width:468pt;height:.05pt;mso-width-percent:0;mso-height-percent:0;mso-width-percent:0;mso-height-percent:0" o:hralign="center" o:hrstd="t" o:hr="t" fillcolor="#a0a0a0" stroked="f"/>
         </w:pict>
       </w:r>
     </w:p>
@@ -353,7 +369,6 @@
         <w:rPr>
           <w:b/>
           <w:bCs/>
-          <w:color w:val="000000"/>
         </w:rPr>
       </w:pPr>
       <w:bookmarkStart w:id="7" w:name="_bdnk32ts2v0v" w:colFirst="0" w:colLast="0"/>
@@ -364,8 +379,18 @@
           <w:bCs/>
           <w:color w:val="000000"/>
         </w:rPr>
-        <w:t xml:space="preserve">Date: </w:t>
-      </w:r>
+        <w:t>Date: Wednesday Feb 4th</w:t>
+      </w:r>
+      <w:proofErr w:type="gramStart"/>
+      <w:r>
+        <w:rPr>
+          <w:b/>
+          <w:bCs/>
+          <w:color w:val="000000"/>
+        </w:rPr>
+        <w:t xml:space="preserve"> 2026</w:t>
+      </w:r>
+      <w:proofErr w:type="gramEnd"/>
     </w:p>
     <w:p>
       <w:pPr>
@@ -373,18 +398,15 @@
         <w:rPr>
           <w:b/>
           <w:bCs/>
-          <w:color w:val="000000"/>
-        </w:rPr>
-      </w:pPr>
-      <w:bookmarkStart w:id="8" w:name="_64q73h3bobuu" w:colFirst="0" w:colLast="0"/>
-      <w:bookmarkEnd w:id="8"/>
-      <w:r>
-        <w:rPr>
-          <w:b/>
-          <w:bCs/>
-          <w:color w:val="000000"/>
-        </w:rPr>
-        <w:t>Time:</w:t>
+        </w:rPr>
+      </w:pPr>
+      <w:r>
+        <w:rPr>
+          <w:b/>
+          <w:bCs/>
+          <w:color w:val="000000"/>
+        </w:rPr>
+        <w:t>Time: 1.5hours </w:t>
       </w:r>
     </w:p>
     <w:p>
@@ -395,8 +417,6 @@
           <w:bCs/>
         </w:rPr>
       </w:pPr>
-      <w:bookmarkStart w:id="9" w:name="_7sdmmd67xaz" w:colFirst="0" w:colLast="0"/>
-      <w:bookmarkEnd w:id="9"/>
       <w:r>
         <w:rPr>
           <w:b/>
@@ -408,6 +428,84 @@
     </w:p>
     <w:p>
       <w:pPr>
+        <w:pStyle w:val="NormalWeb"/>
+        <w:numPr>
+          <w:ilvl w:val="0"/>
+          <w:numId w:val="3"/>
+        </w:numPr>
+        <w:spacing w:before="0" w:beforeAutospacing="0" w:after="0" w:afterAutospacing="0"/>
+        <w:textAlignment w:val="baseline"/>
+        <w:rPr>
+          <w:rFonts w:ascii="Arial" w:hAnsi="Arial" w:cs="Arial"/>
+          <w:color w:val="000000"/>
+          <w:sz w:val="22"/>
+          <w:szCs w:val="22"/>
+        </w:rPr>
+      </w:pPr>
+      <w:r>
+        <w:rPr>
+          <w:rFonts w:ascii="Arial" w:hAnsi="Arial" w:cs="Arial"/>
+          <w:color w:val="000000"/>
+          <w:sz w:val="22"/>
+          <w:szCs w:val="22"/>
+        </w:rPr>
+        <w:t>Each showed their progress</w:t>
+      </w:r>
+    </w:p>
+    <w:p>
+      <w:pPr>
+        <w:pStyle w:val="NormalWeb"/>
+        <w:numPr>
+          <w:ilvl w:val="0"/>
+          <w:numId w:val="3"/>
+        </w:numPr>
+        <w:spacing w:before="0" w:beforeAutospacing="0" w:after="0" w:afterAutospacing="0"/>
+        <w:textAlignment w:val="baseline"/>
+        <w:rPr>
+          <w:rFonts w:ascii="Arial" w:hAnsi="Arial" w:cs="Arial"/>
+          <w:color w:val="000000"/>
+          <w:sz w:val="22"/>
+          <w:szCs w:val="22"/>
+        </w:rPr>
+      </w:pPr>
+      <w:r>
+        <w:rPr>
+          <w:rFonts w:ascii="Arial" w:hAnsi="Arial" w:cs="Arial"/>
+          <w:color w:val="000000"/>
+          <w:sz w:val="22"/>
+          <w:szCs w:val="22"/>
+        </w:rPr>
+        <w:t>Discussed what was left to do and who will be assigned to do it</w:t>
+      </w:r>
+    </w:p>
+    <w:p>
+      <w:pPr>
+        <w:pStyle w:val="NormalWeb"/>
+        <w:numPr>
+          <w:ilvl w:val="0"/>
+          <w:numId w:val="3"/>
+        </w:numPr>
+        <w:spacing w:before="0" w:beforeAutospacing="0" w:after="0" w:afterAutospacing="0"/>
+        <w:textAlignment w:val="baseline"/>
+        <w:rPr>
+          <w:rFonts w:ascii="Arial" w:hAnsi="Arial" w:cs="Arial"/>
+          <w:color w:val="000000"/>
+          <w:sz w:val="22"/>
+          <w:szCs w:val="22"/>
+        </w:rPr>
+      </w:pPr>
+      <w:r>
+        <w:rPr>
+          <w:rFonts w:ascii="Arial" w:hAnsi="Arial" w:cs="Arial"/>
+          <w:color w:val="000000"/>
+          <w:sz w:val="22"/>
+          <w:szCs w:val="22"/>
+        </w:rPr>
+        <w:t>Discussed the demo</w:t>
+      </w:r>
+    </w:p>
+    <w:p>
+      <w:pPr>
         <w:rPr>
           <w:b/>
           <w:bCs/>
@@ -418,339 +516,6 @@
           <w:noProof/>
         </w:rPr>
         <w:pict w14:anchorId="2CCFF985">
-          <v:rect id="_x0000_i1029" alt="" style="width:468pt;height:.05pt;mso-width-percent:0;mso-height-percent:0;mso-width-percent:0;mso-height-percent:0" o:hralign="center" o:hrstd="t" o:hr="t" fillcolor="#a0a0a0" stroked="f"/>
-        </w:pict>
-      </w:r>
-    </w:p>
-    <w:p>
-      <w:pPr>
-        <w:rPr>
-          <w:b/>
-          <w:bCs/>
-        </w:rPr>
-      </w:pPr>
-    </w:p>
-    <w:p>
-      <w:pPr>
-        <w:pStyle w:val="Heading3"/>
-        <w:rPr>
-          <w:b/>
-          <w:bCs/>
-          <w:color w:val="000000"/>
-        </w:rPr>
-      </w:pPr>
-      <w:bookmarkStart w:id="10" w:name="_ckz4mb249khz" w:colFirst="0" w:colLast="0"/>
-      <w:bookmarkEnd w:id="10"/>
-      <w:r>
-        <w:rPr>
-          <w:b/>
-          <w:bCs/>
-          <w:color w:val="000000"/>
-        </w:rPr>
-        <w:lastRenderedPageBreak/>
-        <w:t xml:space="preserve">Date: </w:t>
-      </w:r>
-    </w:p>
-    <w:p>
-      <w:pPr>
-        <w:pStyle w:val="Heading3"/>
-        <w:rPr>
-          <w:b/>
-          <w:bCs/>
-          <w:color w:val="000000"/>
-        </w:rPr>
-      </w:pPr>
-      <w:bookmarkStart w:id="11" w:name="_82nwf9gdompr" w:colFirst="0" w:colLast="0"/>
-      <w:bookmarkEnd w:id="11"/>
-      <w:r>
-        <w:rPr>
-          <w:b/>
-          <w:bCs/>
-          <w:color w:val="000000"/>
-        </w:rPr>
-        <w:t>Time:</w:t>
-      </w:r>
-    </w:p>
-    <w:p>
-      <w:pPr>
-        <w:pStyle w:val="Heading3"/>
-        <w:rPr>
-          <w:b/>
-          <w:bCs/>
-        </w:rPr>
-      </w:pPr>
-      <w:bookmarkStart w:id="12" w:name="_qntmj9vyxqpc" w:colFirst="0" w:colLast="0"/>
-      <w:bookmarkEnd w:id="12"/>
-      <w:r>
-        <w:rPr>
-          <w:b/>
-          <w:bCs/>
-          <w:color w:val="000000"/>
-        </w:rPr>
-        <w:t>What we did:</w:t>
-      </w:r>
-    </w:p>
-    <w:p>
-      <w:pPr>
-        <w:rPr>
-          <w:b/>
-          <w:bCs/>
-        </w:rPr>
-      </w:pPr>
-      <w:r>
-        <w:rPr>
-          <w:noProof/>
-        </w:rPr>
-        <w:pict w14:anchorId="5DD05388">
-          <v:rect id="_x0000_i1028" alt="" style="width:468pt;height:.05pt;mso-width-percent:0;mso-height-percent:0;mso-width-percent:0;mso-height-percent:0" o:hralign="center" o:hrstd="t" o:hr="t" fillcolor="#a0a0a0" stroked="f"/>
-        </w:pict>
-      </w:r>
-    </w:p>
-    <w:p>
-      <w:pPr>
-        <w:rPr>
-          <w:b/>
-          <w:bCs/>
-        </w:rPr>
-      </w:pPr>
-    </w:p>
-    <w:p>
-      <w:pPr>
-        <w:pStyle w:val="Heading3"/>
-        <w:rPr>
-          <w:b/>
-          <w:bCs/>
-          <w:color w:val="000000"/>
-        </w:rPr>
-      </w:pPr>
-      <w:bookmarkStart w:id="13" w:name="_koftgsl48av" w:colFirst="0" w:colLast="0"/>
-      <w:bookmarkEnd w:id="13"/>
-      <w:r>
-        <w:rPr>
-          <w:b/>
-          <w:bCs/>
-          <w:color w:val="000000"/>
-        </w:rPr>
-        <w:t xml:space="preserve">Date: </w:t>
-      </w:r>
-    </w:p>
-    <w:p>
-      <w:pPr>
-        <w:pStyle w:val="Heading3"/>
-        <w:rPr>
-          <w:b/>
-          <w:bCs/>
-          <w:color w:val="000000"/>
-        </w:rPr>
-      </w:pPr>
-      <w:bookmarkStart w:id="14" w:name="_bq8yx313xq3r" w:colFirst="0" w:colLast="0"/>
-      <w:bookmarkEnd w:id="14"/>
-      <w:r>
-        <w:rPr>
-          <w:b/>
-          <w:bCs/>
-          <w:color w:val="000000"/>
-        </w:rPr>
-        <w:t>Time:</w:t>
-      </w:r>
-    </w:p>
-    <w:p>
-      <w:pPr>
-        <w:pStyle w:val="Heading3"/>
-        <w:rPr>
-          <w:b/>
-          <w:bCs/>
-        </w:rPr>
-      </w:pPr>
-      <w:bookmarkStart w:id="15" w:name="_yv7yrzu2d7ke" w:colFirst="0" w:colLast="0"/>
-      <w:bookmarkEnd w:id="15"/>
-      <w:r>
-        <w:rPr>
-          <w:b/>
-          <w:bCs/>
-          <w:color w:val="000000"/>
-        </w:rPr>
-        <w:t>What we did:</w:t>
-      </w:r>
-    </w:p>
-    <w:p>
-      <w:pPr>
-        <w:rPr>
-          <w:b/>
-          <w:bCs/>
-        </w:rPr>
-      </w:pPr>
-      <w:r>
-        <w:rPr>
-          <w:noProof/>
-        </w:rPr>
-        <w:pict w14:anchorId="4745901D">
-          <v:rect id="_x0000_i1027" alt="" style="width:468pt;height:.05pt;mso-width-percent:0;mso-height-percent:0;mso-width-percent:0;mso-height-percent:0" o:hralign="center" o:hrstd="t" o:hr="t" fillcolor="#a0a0a0" stroked="f"/>
-        </w:pict>
-      </w:r>
-    </w:p>
-    <w:p>
-      <w:pPr>
-        <w:rPr>
-          <w:b/>
-          <w:bCs/>
-        </w:rPr>
-      </w:pPr>
-    </w:p>
-    <w:p>
-      <w:pPr>
-        <w:pStyle w:val="Heading3"/>
-        <w:rPr>
-          <w:b/>
-          <w:bCs/>
-          <w:color w:val="000000"/>
-        </w:rPr>
-      </w:pPr>
-      <w:bookmarkStart w:id="16" w:name="_erpm089o75pg" w:colFirst="0" w:colLast="0"/>
-      <w:bookmarkEnd w:id="16"/>
-      <w:r>
-        <w:rPr>
-          <w:b/>
-          <w:bCs/>
-          <w:color w:val="000000"/>
-        </w:rPr>
-        <w:t xml:space="preserve">Date: </w:t>
-      </w:r>
-    </w:p>
-    <w:p>
-      <w:pPr>
-        <w:pStyle w:val="Heading3"/>
-        <w:rPr>
-          <w:b/>
-          <w:bCs/>
-          <w:color w:val="000000"/>
-        </w:rPr>
-      </w:pPr>
-      <w:bookmarkStart w:id="17" w:name="_fo9zfb8dse60" w:colFirst="0" w:colLast="0"/>
-      <w:bookmarkEnd w:id="17"/>
-      <w:r>
-        <w:rPr>
-          <w:b/>
-          <w:bCs/>
-          <w:color w:val="000000"/>
-        </w:rPr>
-        <w:t>Time:</w:t>
-      </w:r>
-    </w:p>
-    <w:p>
-      <w:pPr>
-        <w:pStyle w:val="Heading3"/>
-        <w:rPr>
-          <w:b/>
-          <w:bCs/>
-        </w:rPr>
-      </w:pPr>
-      <w:bookmarkStart w:id="18" w:name="_w5r682tqq3a0" w:colFirst="0" w:colLast="0"/>
-      <w:bookmarkEnd w:id="18"/>
-      <w:r>
-        <w:rPr>
-          <w:b/>
-          <w:bCs/>
-          <w:color w:val="000000"/>
-        </w:rPr>
-        <w:t>What we did:</w:t>
-      </w:r>
-    </w:p>
-    <w:p>
-      <w:pPr>
-        <w:rPr>
-          <w:b/>
-          <w:bCs/>
-        </w:rPr>
-      </w:pPr>
-      <w:r>
-        <w:rPr>
-          <w:noProof/>
-        </w:rPr>
-        <w:pict w14:anchorId="7C7BB01A">
-          <v:rect id="_x0000_i1026" alt="" style="width:468pt;height:.05pt;mso-width-percent:0;mso-height-percent:0;mso-width-percent:0;mso-height-percent:0" o:hralign="center" o:hrstd="t" o:hr="t" fillcolor="#a0a0a0" stroked="f"/>
-        </w:pict>
-      </w:r>
-    </w:p>
-    <w:p>
-      <w:pPr>
-        <w:rPr>
-          <w:b/>
-          <w:bCs/>
-        </w:rPr>
-      </w:pPr>
-    </w:p>
-    <w:p>
-      <w:pPr>
-        <w:pStyle w:val="Heading3"/>
-        <w:rPr>
-          <w:b/>
-          <w:bCs/>
-          <w:color w:val="000000"/>
-        </w:rPr>
-      </w:pPr>
-      <w:bookmarkStart w:id="19" w:name="_ntndizg97gkr" w:colFirst="0" w:colLast="0"/>
-      <w:bookmarkEnd w:id="19"/>
-      <w:r>
-        <w:rPr>
-          <w:b/>
-          <w:bCs/>
-          <w:color w:val="000000"/>
-        </w:rPr>
-        <w:t xml:space="preserve">Date: </w:t>
-      </w:r>
-    </w:p>
-    <w:p>
-      <w:pPr>
-        <w:pStyle w:val="Heading3"/>
-        <w:rPr>
-          <w:b/>
-          <w:bCs/>
-          <w:color w:val="000000"/>
-        </w:rPr>
-      </w:pPr>
-      <w:bookmarkStart w:id="20" w:name="_za4zoxwrs6ab" w:colFirst="0" w:colLast="0"/>
-      <w:bookmarkEnd w:id="20"/>
-      <w:r>
-        <w:rPr>
-          <w:b/>
-          <w:bCs/>
-          <w:color w:val="000000"/>
-        </w:rPr>
-        <w:t>Time:</w:t>
-      </w:r>
-    </w:p>
-    <w:p>
-      <w:pPr>
-        <w:pStyle w:val="Heading3"/>
-        <w:rPr>
-          <w:b/>
-          <w:bCs/>
-        </w:rPr>
-      </w:pPr>
-      <w:bookmarkStart w:id="21" w:name="_ofvjezsv4937" w:colFirst="0" w:colLast="0"/>
-      <w:bookmarkEnd w:id="21"/>
-      <w:r>
-        <w:rPr>
-          <w:b/>
-          <w:bCs/>
-          <w:color w:val="000000"/>
-        </w:rPr>
-        <w:t>What we did:</w:t>
-      </w:r>
-    </w:p>
-    <w:p>
-      <w:pPr>
-        <w:rPr>
-          <w:b/>
-          <w:bCs/>
-        </w:rPr>
-      </w:pPr>
-      <w:r>
-        <w:rPr>
-          <w:noProof/>
-        </w:rPr>
-        <w:pict w14:anchorId="1694ACF2">
           <v:rect id="_x0000_i1025" alt="" style="width:468pt;height:.05pt;mso-width-percent:0;mso-height-percent:0;mso-width-percent:0;mso-height-percent:0" o:hralign="center" o:hrstd="t" o:hr="t" fillcolor="#a0a0a0" stroked="f"/>
         </w:pict>
       </w:r>
@@ -762,14 +527,8 @@
           <w:bCs/>
         </w:rPr>
       </w:pPr>
-    </w:p>
-    <w:p>
-      <w:pPr>
-        <w:rPr>
-          <w:b/>
-          <w:bCs/>
-        </w:rPr>
-      </w:pPr>
+      <w:bookmarkStart w:id="8" w:name="_ckz4mb249khz" w:colFirst="0" w:colLast="0"/>
+      <w:bookmarkEnd w:id="8"/>
     </w:p>
     <w:p>
       <w:pPr>
@@ -905,6 +664,155 @@
     </w:lvl>
   </w:abstractNum>
   <w:abstractNum w:abstractNumId="1" w15:restartNumberingAfterBreak="0">
+    <w:nsid w:val="6A725568"/>
+    <w:multiLevelType w:val="multilevel"/>
+    <w:tmpl w:val="73AA9FE8"/>
+    <w:lvl w:ilvl="0">
+      <w:start w:val="1"/>
+      <w:numFmt w:val="bullet"/>
+      <w:lvlText w:val=""/>
+      <w:lvlJc w:val="left"/>
+      <w:pPr>
+        <w:tabs>
+          <w:tab w:val="num" w:pos="720"/>
+        </w:tabs>
+        <w:ind w:left="720" w:hanging="360"/>
+      </w:pPr>
+      <w:rPr>
+        <w:rFonts w:ascii="Symbol" w:hAnsi="Symbol" w:hint="default"/>
+        <w:sz w:val="20"/>
+      </w:rPr>
+    </w:lvl>
+    <w:lvl w:ilvl="1" w:tentative="1">
+      <w:start w:val="1"/>
+      <w:numFmt w:val="bullet"/>
+      <w:lvlText w:val="o"/>
+      <w:lvlJc w:val="left"/>
+      <w:pPr>
+        <w:tabs>
+          <w:tab w:val="num" w:pos="1440"/>
+        </w:tabs>
+        <w:ind w:left="1440" w:hanging="360"/>
+      </w:pPr>
+      <w:rPr>
+        <w:rFonts w:ascii="Courier New" w:hAnsi="Courier New" w:hint="default"/>
+        <w:sz w:val="20"/>
+      </w:rPr>
+    </w:lvl>
+    <w:lvl w:ilvl="2" w:tentative="1">
+      <w:start w:val="1"/>
+      <w:numFmt w:val="bullet"/>
+      <w:lvlText w:val=""/>
+      <w:lvlJc w:val="left"/>
+      <w:pPr>
+        <w:tabs>
+          <w:tab w:val="num" w:pos="2160"/>
+        </w:tabs>
+        <w:ind w:left="2160" w:hanging="360"/>
+      </w:pPr>
+      <w:rPr>
+        <w:rFonts w:ascii="Wingdings" w:hAnsi="Wingdings" w:hint="default"/>
+        <w:sz w:val="20"/>
+      </w:rPr>
+    </w:lvl>
+    <w:lvl w:ilvl="3" w:tentative="1">
+      <w:start w:val="1"/>
+      <w:numFmt w:val="bullet"/>
+      <w:lvlText w:val=""/>
+      <w:lvlJc w:val="left"/>
+      <w:pPr>
+        <w:tabs>
+          <w:tab w:val="num" w:pos="2880"/>
+        </w:tabs>
+        <w:ind w:left="2880" w:hanging="360"/>
+      </w:pPr>
+      <w:rPr>
+        <w:rFonts w:ascii="Wingdings" w:hAnsi="Wingdings" w:hint="default"/>
+        <w:sz w:val="20"/>
+      </w:rPr>
+    </w:lvl>
+    <w:lvl w:ilvl="4" w:tentative="1">
+      <w:start w:val="1"/>
+      <w:numFmt w:val="bullet"/>
+      <w:lvlText w:val=""/>
+      <w:lvlJc w:val="left"/>
+      <w:pPr>
+        <w:tabs>
+          <w:tab w:val="num" w:pos="3600"/>
+        </w:tabs>
+        <w:ind w:left="3600" w:hanging="360"/>
+      </w:pPr>
+      <w:rPr>
+        <w:rFonts w:ascii="Wingdings" w:hAnsi="Wingdings" w:hint="default"/>
+        <w:sz w:val="20"/>
+      </w:rPr>
+    </w:lvl>
+    <w:lvl w:ilvl="5" w:tentative="1">
+      <w:start w:val="1"/>
+      <w:numFmt w:val="bullet"/>
+      <w:lvlText w:val=""/>
+      <w:lvlJc w:val="left"/>
+      <w:pPr>
+        <w:tabs>
+          <w:tab w:val="num" w:pos="4320"/>
+        </w:tabs>
+        <w:ind w:left="4320" w:hanging="360"/>
+      </w:pPr>
+      <w:rPr>
+        <w:rFonts w:ascii="Wingdings" w:hAnsi="Wingdings" w:hint="default"/>
+        <w:sz w:val="20"/>
+      </w:rPr>
+    </w:lvl>
+    <w:lvl w:ilvl="6" w:tentative="1">
+      <w:start w:val="1"/>
+      <w:numFmt w:val="bullet"/>
+      <w:lvlText w:val=""/>
+      <w:lvlJc w:val="left"/>
+      <w:pPr>
+        <w:tabs>
+          <w:tab w:val="num" w:pos="5040"/>
+        </w:tabs>
+        <w:ind w:left="5040" w:hanging="360"/>
+      </w:pPr>
+      <w:rPr>
+        <w:rFonts w:ascii="Wingdings" w:hAnsi="Wingdings" w:hint="default"/>
+        <w:sz w:val="20"/>
+      </w:rPr>
+    </w:lvl>
+    <w:lvl w:ilvl="7" w:tentative="1">
+      <w:start w:val="1"/>
+      <w:numFmt w:val="bullet"/>
+      <w:lvlText w:val=""/>
+      <w:lvlJc w:val="left"/>
+      <w:pPr>
+        <w:tabs>
+          <w:tab w:val="num" w:pos="5760"/>
+        </w:tabs>
+        <w:ind w:left="5760" w:hanging="360"/>
+      </w:pPr>
+      <w:rPr>
+        <w:rFonts w:ascii="Wingdings" w:hAnsi="Wingdings" w:hint="default"/>
+        <w:sz w:val="20"/>
+      </w:rPr>
+    </w:lvl>
+    <w:lvl w:ilvl="8" w:tentative="1">
+      <w:start w:val="1"/>
+      <w:numFmt w:val="bullet"/>
+      <w:lvlText w:val=""/>
+      <w:lvlJc w:val="left"/>
+      <w:pPr>
+        <w:tabs>
+          <w:tab w:val="num" w:pos="6480"/>
+        </w:tabs>
+        <w:ind w:left="6480" w:hanging="360"/>
+      </w:pPr>
+      <w:rPr>
+        <w:rFonts w:ascii="Wingdings" w:hAnsi="Wingdings" w:hint="default"/>
+        <w:sz w:val="20"/>
+      </w:rPr>
+    </w:lvl>
+  </w:abstractNum>
+  <w:abstractNum w:abstractNumId="2" w15:restartNumberingAfterBreak="0">
     <w:nsid w:val="6F2664E4"/>
     <w:multiLevelType w:val="multilevel"/>
     <w:tmpl w:val="76CE1690"/>
@@ -1021,6 +929,9 @@
     <w:abstractNumId w:val="0"/>
   </w:num>
   <w:num w:numId="2" w16cid:durableId="939528993">
+    <w:abstractNumId w:val="2"/>
+  </w:num>
+  <w:num w:numId="3" w16cid:durableId="2630226">
     <w:abstractNumId w:val="1"/>
   </w:num>
 </w:numbering>
@@ -1608,6 +1519,23 @@
       <w:szCs w:val="30"/>
     </w:rPr>
   </w:style>
+  <w:style w:type="paragraph" w:styleId="NormalWeb">
+    <w:name w:val="Normal (Web)"/>
+    <w:basedOn w:val="Normal"/>
+    <w:uiPriority w:val="99"/>
+    <w:semiHidden/>
+    <w:unhideWhenUsed/>
+    <w:rsid w:val="00A47168"/>
+    <w:pPr>
+      <w:spacing w:before="100" w:beforeAutospacing="1" w:after="100" w:afterAutospacing="1" w:line="240" w:lineRule="auto"/>
+    </w:pPr>
+    <w:rPr>
+      <w:rFonts w:ascii="Times New Roman" w:eastAsia="Times New Roman" w:hAnsi="Times New Roman" w:cs="Times New Roman"/>
+      <w:sz w:val="24"/>
+      <w:szCs w:val="24"/>
+      <w:lang w:val="en-CA"/>
+    </w:rPr>
+  </w:style>
 </w:styles>
 </file>
 

</xml_diff>